<commit_message>
Correction de la version avec nouveau second deck
</commit_message>
<xml_diff>
--- a/pictures/Memos/memos-fr.docx
+++ b/pictures/Memos/memos-fr.docx
@@ -14,7 +14,7 @@
         <mc:AlternateContent>
           <mc:Choice Requires="wpc">
             <w:drawing>
-              <wp:inline distT="0" distB="0" distL="0" distR="0" wp14:anchorId="3F35520E" wp14:editId="7E64F80E">
+              <wp:inline distT="0" distB="0" distL="0" distR="0" wp14:anchorId="3F35520E" wp14:editId="32F71F64">
                 <wp:extent cx="10276840" cy="7200900"/>
                 <wp:effectExtent l="0" t="0" r="0" b="0"/>
                 <wp:docPr id="1879269446" name="Zone de dessin 1"/>
@@ -32,13 +32,13 @@
                       </wpc:bg>
                       <wpc:whole/>
                       <wpg:wgp>
-                        <wpg:cNvPr id="148342048" name="Groupe 148342048"/>
+                        <wpg:cNvPr id="1841248240" name="Groupe 1841248240"/>
                         <wpg:cNvGrpSpPr/>
                         <wpg:grpSpPr>
                           <a:xfrm>
                             <a:off x="489692" y="314326"/>
                             <a:ext cx="3960390" cy="3121564"/>
-                            <a:chOff x="682831" y="464784"/>
+                            <a:chOff x="489692" y="314326"/>
                             <a:chExt cx="3960390" cy="3121564"/>
                           </a:xfrm>
                         </wpg:grpSpPr>
@@ -47,7 +47,7 @@
                           <wps:cNvSpPr/>
                           <wps:spPr>
                             <a:xfrm>
-                              <a:off x="682831" y="464784"/>
+                              <a:off x="489692" y="314326"/>
                               <a:ext cx="3960390" cy="3121564"/>
                             </a:xfrm>
                             <a:prstGeom prst="rect">
@@ -105,47 +105,8 @@
                           </pic:blipFill>
                           <pic:spPr bwMode="auto">
                             <a:xfrm>
-                              <a:off x="852036" y="601574"/>
+                              <a:off x="639847" y="451116"/>
                               <a:ext cx="3645535" cy="1839595"/>
-                            </a:xfrm>
-                            <a:prstGeom prst="rect">
-                              <a:avLst/>
-                            </a:prstGeom>
-                            <a:noFill/>
-                            <a:ln>
-                              <a:noFill/>
-                            </a:ln>
-                            <a:extLst>
-                              <a:ext uri="{53640926-AAD7-44D8-BBD7-CCE9431645EC}">
-                                <a14:shadowObscured xmlns:a14="http://schemas.microsoft.com/office/drawing/2010/main"/>
-                              </a:ext>
-                            </a:extLst>
-                          </pic:spPr>
-                        </pic:pic>
-                        <pic:pic xmlns:pic="http://schemas.openxmlformats.org/drawingml/2006/picture">
-                          <pic:nvPicPr>
-                            <pic:cNvPr id="1077118535" name="Image 1077118535"/>
-                            <pic:cNvPicPr>
-                              <a:picLocks noChangeAspect="1"/>
-                            </pic:cNvPicPr>
-                          </pic:nvPicPr>
-                          <pic:blipFill rotWithShape="1">
-                            <a:blip r:embed="rId8">
-                              <a:extLst>
-                                <a:ext uri="{28A0092B-C50C-407E-A947-70E740481C1C}">
-                                  <a14:useLocalDpi xmlns:a14="http://schemas.microsoft.com/office/drawing/2010/main" val="0"/>
-                                </a:ext>
-                              </a:extLst>
-                            </a:blip>
-                            <a:srcRect l="35764" r="35779" b="24600"/>
-                            <a:stretch>
-                              <a:fillRect/>
-                            </a:stretch>
-                          </pic:blipFill>
-                          <pic:spPr bwMode="auto">
-                            <a:xfrm>
-                              <a:off x="851754" y="2549128"/>
-                              <a:ext cx="2938145" cy="871855"/>
                             </a:xfrm>
                             <a:prstGeom prst="rect">
                               <a:avLst/>
@@ -169,7 +130,7 @@
                             </pic:cNvPicPr>
                           </pic:nvPicPr>
                           <pic:blipFill>
-                            <a:blip r:embed="rId9">
+                            <a:blip r:embed="rId8">
                               <a:lum bright="70000" contrast="-70000"/>
                               <a:extLst>
                                 <a:ext uri="{28A0092B-C50C-407E-A947-70E740481C1C}">
@@ -184,7 +145,7 @@
                           </pic:blipFill>
                           <pic:spPr bwMode="auto">
                             <a:xfrm>
-                              <a:off x="3807859" y="2644130"/>
+                              <a:off x="3614720" y="2493672"/>
                               <a:ext cx="719992" cy="720000"/>
                             </a:xfrm>
                             <a:prstGeom prst="rect">
@@ -204,7 +165,7 @@
                             </pic:cNvPicPr>
                           </pic:nvPicPr>
                           <pic:blipFill>
-                            <a:blip r:embed="rId9">
+                            <a:blip r:embed="rId8">
                               <a:lum bright="70000" contrast="-70000"/>
                               <a:extLst>
                                 <a:ext uri="{28A0092B-C50C-407E-A947-70E740481C1C}">
@@ -219,7 +180,7 @@
                           </pic:blipFill>
                           <pic:spPr bwMode="auto">
                             <a:xfrm flipH="1">
-                              <a:off x="874694" y="552202"/>
+                              <a:off x="681555" y="401744"/>
                               <a:ext cx="719991" cy="720000"/>
                             </a:xfrm>
                             <a:prstGeom prst="rect">
@@ -231,20 +192,59 @@
                             </a:ln>
                           </pic:spPr>
                         </pic:pic>
+                        <pic:pic xmlns:pic="http://schemas.openxmlformats.org/drawingml/2006/picture">
+                          <pic:nvPicPr>
+                            <pic:cNvPr id="72853127" name="Image 72853127"/>
+                            <pic:cNvPicPr>
+                              <a:picLocks noChangeAspect="1"/>
+                            </pic:cNvPicPr>
+                          </pic:nvPicPr>
+                          <pic:blipFill rotWithShape="1">
+                            <a:blip r:embed="rId9">
+                              <a:extLst>
+                                <a:ext uri="{28A0092B-C50C-407E-A947-70E740481C1C}">
+                                  <a14:useLocalDpi xmlns:a14="http://schemas.microsoft.com/office/drawing/2010/main" val="0"/>
+                                </a:ext>
+                              </a:extLst>
+                            </a:blip>
+                            <a:srcRect l="35741" r="35742" b="25534"/>
+                            <a:stretch>
+                              <a:fillRect/>
+                            </a:stretch>
+                          </pic:blipFill>
+                          <pic:spPr bwMode="auto">
+                            <a:xfrm>
+                              <a:off x="640005" y="2423927"/>
+                              <a:ext cx="2944495" cy="862965"/>
+                            </a:xfrm>
+                            <a:prstGeom prst="rect">
+                              <a:avLst/>
+                            </a:prstGeom>
+                            <a:noFill/>
+                            <a:ln>
+                              <a:noFill/>
+                            </a:ln>
+                            <a:extLst>
+                              <a:ext uri="{53640926-AAD7-44D8-BBD7-CCE9431645EC}">
+                                <a14:shadowObscured xmlns:a14="http://schemas.microsoft.com/office/drawing/2010/main"/>
+                              </a:ext>
+                            </a:extLst>
+                          </pic:spPr>
+                        </pic:pic>
                       </wpg:wgp>
                       <wpg:wgp>
-                        <wpg:cNvPr id="898762782" name="Groupe 898762782"/>
+                        <wpg:cNvPr id="2130575211" name="Groupe 2130575211"/>
                         <wpg:cNvGrpSpPr/>
                         <wpg:grpSpPr>
                           <a:xfrm>
-                            <a:off x="5016061" y="314865"/>
+                            <a:off x="4745650" y="314326"/>
                             <a:ext cx="3959860" cy="3121025"/>
                             <a:chOff x="0" y="0"/>
                             <a:chExt cx="3960390" cy="3121564"/>
                           </a:xfrm>
                         </wpg:grpSpPr>
                         <wps:wsp>
-                          <wps:cNvPr id="1954096823" name="Rectangle 1954096823"/>
+                          <wps:cNvPr id="650922340" name="Rectangle 650922340"/>
                           <wps:cNvSpPr/>
                           <wps:spPr>
                             <a:xfrm>
@@ -286,7 +286,7 @@
                         </wps:wsp>
                         <pic:pic xmlns:pic="http://schemas.openxmlformats.org/drawingml/2006/picture">
                           <pic:nvPicPr>
-                            <pic:cNvPr id="1669418917" name="Image 1669418917"/>
+                            <pic:cNvPr id="1497182814" name="Image 1497182814"/>
                             <pic:cNvPicPr>
                               <a:picLocks noChangeAspect="1"/>
                             </pic:cNvPicPr>
@@ -306,7 +306,7 @@
                           </pic:blipFill>
                           <pic:spPr bwMode="auto">
                             <a:xfrm>
-                              <a:off x="169205" y="136790"/>
+                              <a:off x="150155" y="136790"/>
                               <a:ext cx="3645535" cy="1839595"/>
                             </a:xfrm>
                             <a:prstGeom prst="rect">
@@ -325,52 +325,13 @@
                         </pic:pic>
                         <pic:pic xmlns:pic="http://schemas.openxmlformats.org/drawingml/2006/picture">
                           <pic:nvPicPr>
-                            <pic:cNvPr id="2081468940" name="Image 2081468940"/>
-                            <pic:cNvPicPr>
-                              <a:picLocks noChangeAspect="1"/>
-                            </pic:cNvPicPr>
-                          </pic:nvPicPr>
-                          <pic:blipFill rotWithShape="1">
-                            <a:blip r:embed="rId8">
-                              <a:extLst>
-                                <a:ext uri="{28A0092B-C50C-407E-A947-70E740481C1C}">
-                                  <a14:useLocalDpi xmlns:a14="http://schemas.microsoft.com/office/drawing/2010/main" val="0"/>
-                                </a:ext>
-                              </a:extLst>
-                            </a:blip>
-                            <a:srcRect l="35764" r="35779" b="24600"/>
-                            <a:stretch>
-                              <a:fillRect/>
-                            </a:stretch>
-                          </pic:blipFill>
-                          <pic:spPr bwMode="auto">
-                            <a:xfrm>
-                              <a:off x="168923" y="2084344"/>
-                              <a:ext cx="2938145" cy="871855"/>
-                            </a:xfrm>
-                            <a:prstGeom prst="rect">
-                              <a:avLst/>
-                            </a:prstGeom>
-                            <a:noFill/>
-                            <a:ln>
-                              <a:noFill/>
-                            </a:ln>
-                            <a:extLst>
-                              <a:ext uri="{53640926-AAD7-44D8-BBD7-CCE9431645EC}">
-                                <a14:shadowObscured xmlns:a14="http://schemas.microsoft.com/office/drawing/2010/main"/>
-                              </a:ext>
-                            </a:extLst>
-                          </pic:spPr>
-                        </pic:pic>
-                        <pic:pic xmlns:pic="http://schemas.openxmlformats.org/drawingml/2006/picture">
-                          <pic:nvPicPr>
-                            <pic:cNvPr id="1860022118" name="Image 1860022118"/>
+                            <pic:cNvPr id="1796803993" name="Image 1796803993"/>
                             <pic:cNvPicPr>
                               <a:picLocks noChangeAspect="1"/>
                             </pic:cNvPicPr>
                           </pic:nvPicPr>
                           <pic:blipFill>
-                            <a:blip r:embed="rId9">
+                            <a:blip r:embed="rId8">
                               <a:lum bright="70000" contrast="-70000"/>
                               <a:extLst>
                                 <a:ext uri="{28A0092B-C50C-407E-A947-70E740481C1C}">
@@ -399,13 +360,13 @@
                         </pic:pic>
                         <pic:pic xmlns:pic="http://schemas.openxmlformats.org/drawingml/2006/picture">
                           <pic:nvPicPr>
-                            <pic:cNvPr id="1810537660" name="Image 1810537660"/>
+                            <pic:cNvPr id="1115001763" name="Image 1115001763"/>
                             <pic:cNvPicPr>
                               <a:picLocks noChangeAspect="1"/>
                             </pic:cNvPicPr>
                           </pic:nvPicPr>
                           <pic:blipFill>
-                            <a:blip r:embed="rId9">
+                            <a:blip r:embed="rId8">
                               <a:lum bright="70000" contrast="-70000"/>
                               <a:extLst>
                                 <a:ext uri="{28A0092B-C50C-407E-A947-70E740481C1C}">
@@ -432,20 +393,59 @@
                             </a:ln>
                           </pic:spPr>
                         </pic:pic>
+                        <pic:pic xmlns:pic="http://schemas.openxmlformats.org/drawingml/2006/picture">
+                          <pic:nvPicPr>
+                            <pic:cNvPr id="1222394338" name="Image 1222394338"/>
+                            <pic:cNvPicPr>
+                              <a:picLocks noChangeAspect="1"/>
+                            </pic:cNvPicPr>
+                          </pic:nvPicPr>
+                          <pic:blipFill rotWithShape="1">
+                            <a:blip r:embed="rId9">
+                              <a:extLst>
+                                <a:ext uri="{28A0092B-C50C-407E-A947-70E740481C1C}">
+                                  <a14:useLocalDpi xmlns:a14="http://schemas.microsoft.com/office/drawing/2010/main" val="0"/>
+                                </a:ext>
+                              </a:extLst>
+                            </a:blip>
+                            <a:srcRect l="35741" r="35742" b="25534"/>
+                            <a:stretch>
+                              <a:fillRect/>
+                            </a:stretch>
+                          </pic:blipFill>
+                          <pic:spPr bwMode="auto">
+                            <a:xfrm>
+                              <a:off x="150313" y="2109601"/>
+                              <a:ext cx="2944495" cy="862965"/>
+                            </a:xfrm>
+                            <a:prstGeom prst="rect">
+                              <a:avLst/>
+                            </a:prstGeom>
+                            <a:noFill/>
+                            <a:ln>
+                              <a:noFill/>
+                            </a:ln>
+                            <a:extLst>
+                              <a:ext uri="{53640926-AAD7-44D8-BBD7-CCE9431645EC}">
+                                <a14:shadowObscured xmlns:a14="http://schemas.microsoft.com/office/drawing/2010/main"/>
+                              </a:ext>
+                            </a:extLst>
+                          </pic:spPr>
+                        </pic:pic>
                       </wpg:wgp>
                       <wpg:wgp>
-                        <wpg:cNvPr id="1693235423" name="Groupe 1693235423"/>
+                        <wpg:cNvPr id="1557453790" name="Groupe 1557453790"/>
                         <wpg:cNvGrpSpPr/>
                         <wpg:grpSpPr>
                           <a:xfrm>
-                            <a:off x="498242" y="3675675"/>
+                            <a:off x="490222" y="3634400"/>
                             <a:ext cx="3959860" cy="3121025"/>
                             <a:chOff x="0" y="0"/>
                             <a:chExt cx="3960390" cy="3121564"/>
                           </a:xfrm>
                         </wpg:grpSpPr>
                         <wps:wsp>
-                          <wps:cNvPr id="16958749" name="Rectangle 16958749"/>
+                          <wps:cNvPr id="278827721" name="Rectangle 278827721"/>
                           <wps:cNvSpPr/>
                           <wps:spPr>
                             <a:xfrm>
@@ -487,7 +487,7 @@
                         </wps:wsp>
                         <pic:pic xmlns:pic="http://schemas.openxmlformats.org/drawingml/2006/picture">
                           <pic:nvPicPr>
-                            <pic:cNvPr id="6051829" name="Image 6051829"/>
+                            <pic:cNvPr id="2132486792" name="Image 2132486792"/>
                             <pic:cNvPicPr>
                               <a:picLocks noChangeAspect="1"/>
                             </pic:cNvPicPr>
@@ -507,7 +507,7 @@
                           </pic:blipFill>
                           <pic:spPr bwMode="auto">
                             <a:xfrm>
-                              <a:off x="169205" y="136790"/>
+                              <a:off x="150155" y="136790"/>
                               <a:ext cx="3645535" cy="1839595"/>
                             </a:xfrm>
                             <a:prstGeom prst="rect">
@@ -526,52 +526,13 @@
                         </pic:pic>
                         <pic:pic xmlns:pic="http://schemas.openxmlformats.org/drawingml/2006/picture">
                           <pic:nvPicPr>
-                            <pic:cNvPr id="1564200997" name="Image 1564200997"/>
-                            <pic:cNvPicPr>
-                              <a:picLocks noChangeAspect="1"/>
-                            </pic:cNvPicPr>
-                          </pic:nvPicPr>
-                          <pic:blipFill rotWithShape="1">
-                            <a:blip r:embed="rId8">
-                              <a:extLst>
-                                <a:ext uri="{28A0092B-C50C-407E-A947-70E740481C1C}">
-                                  <a14:useLocalDpi xmlns:a14="http://schemas.microsoft.com/office/drawing/2010/main" val="0"/>
-                                </a:ext>
-                              </a:extLst>
-                            </a:blip>
-                            <a:srcRect l="35764" r="35779" b="24600"/>
-                            <a:stretch>
-                              <a:fillRect/>
-                            </a:stretch>
-                          </pic:blipFill>
-                          <pic:spPr bwMode="auto">
-                            <a:xfrm>
-                              <a:off x="168923" y="2084344"/>
-                              <a:ext cx="2938145" cy="871855"/>
-                            </a:xfrm>
-                            <a:prstGeom prst="rect">
-                              <a:avLst/>
-                            </a:prstGeom>
-                            <a:noFill/>
-                            <a:ln>
-                              <a:noFill/>
-                            </a:ln>
-                            <a:extLst>
-                              <a:ext uri="{53640926-AAD7-44D8-BBD7-CCE9431645EC}">
-                                <a14:shadowObscured xmlns:a14="http://schemas.microsoft.com/office/drawing/2010/main"/>
-                              </a:ext>
-                            </a:extLst>
-                          </pic:spPr>
-                        </pic:pic>
-                        <pic:pic xmlns:pic="http://schemas.openxmlformats.org/drawingml/2006/picture">
-                          <pic:nvPicPr>
-                            <pic:cNvPr id="1296699028" name="Image 1296699028"/>
+                            <pic:cNvPr id="325094628" name="Image 325094628"/>
                             <pic:cNvPicPr>
                               <a:picLocks noChangeAspect="1"/>
                             </pic:cNvPicPr>
                           </pic:nvPicPr>
                           <pic:blipFill>
-                            <a:blip r:embed="rId9">
+                            <a:blip r:embed="rId8">
                               <a:lum bright="70000" contrast="-70000"/>
                               <a:extLst>
                                 <a:ext uri="{28A0092B-C50C-407E-A947-70E740481C1C}">
@@ -600,13 +561,13 @@
                         </pic:pic>
                         <pic:pic xmlns:pic="http://schemas.openxmlformats.org/drawingml/2006/picture">
                           <pic:nvPicPr>
-                            <pic:cNvPr id="1777609956" name="Image 1777609956"/>
+                            <pic:cNvPr id="1348610929" name="Image 1348610929"/>
                             <pic:cNvPicPr>
                               <a:picLocks noChangeAspect="1"/>
                             </pic:cNvPicPr>
                           </pic:nvPicPr>
                           <pic:blipFill>
-                            <a:blip r:embed="rId9">
+                            <a:blip r:embed="rId8">
                               <a:lum bright="70000" contrast="-70000"/>
                               <a:extLst>
                                 <a:ext uri="{28A0092B-C50C-407E-A947-70E740481C1C}">
@@ -633,20 +594,59 @@
                             </a:ln>
                           </pic:spPr>
                         </pic:pic>
+                        <pic:pic xmlns:pic="http://schemas.openxmlformats.org/drawingml/2006/picture">
+                          <pic:nvPicPr>
+                            <pic:cNvPr id="995971405" name="Image 995971405"/>
+                            <pic:cNvPicPr>
+                              <a:picLocks noChangeAspect="1"/>
+                            </pic:cNvPicPr>
+                          </pic:nvPicPr>
+                          <pic:blipFill rotWithShape="1">
+                            <a:blip r:embed="rId9">
+                              <a:extLst>
+                                <a:ext uri="{28A0092B-C50C-407E-A947-70E740481C1C}">
+                                  <a14:useLocalDpi xmlns:a14="http://schemas.microsoft.com/office/drawing/2010/main" val="0"/>
+                                </a:ext>
+                              </a:extLst>
+                            </a:blip>
+                            <a:srcRect l="35741" r="35742" b="25534"/>
+                            <a:stretch>
+                              <a:fillRect/>
+                            </a:stretch>
+                          </pic:blipFill>
+                          <pic:spPr bwMode="auto">
+                            <a:xfrm>
+                              <a:off x="150313" y="2109601"/>
+                              <a:ext cx="2944495" cy="862965"/>
+                            </a:xfrm>
+                            <a:prstGeom prst="rect">
+                              <a:avLst/>
+                            </a:prstGeom>
+                            <a:noFill/>
+                            <a:ln>
+                              <a:noFill/>
+                            </a:ln>
+                            <a:extLst>
+                              <a:ext uri="{53640926-AAD7-44D8-BBD7-CCE9431645EC}">
+                                <a14:shadowObscured xmlns:a14="http://schemas.microsoft.com/office/drawing/2010/main"/>
+                              </a:ext>
+                            </a:extLst>
+                          </pic:spPr>
+                        </pic:pic>
                       </wpg:wgp>
                       <wpg:wgp>
-                        <wpg:cNvPr id="1993026051" name="Groupe 1993026051"/>
+                        <wpg:cNvPr id="2146968744" name="Groupe 2146968744"/>
                         <wpg:cNvGrpSpPr/>
                         <wpg:grpSpPr>
                           <a:xfrm>
-                            <a:off x="5016061" y="3685200"/>
+                            <a:off x="4739300" y="3634400"/>
                             <a:ext cx="3959860" cy="3121025"/>
                             <a:chOff x="0" y="0"/>
                             <a:chExt cx="3960390" cy="3121564"/>
                           </a:xfrm>
                         </wpg:grpSpPr>
                         <wps:wsp>
-                          <wps:cNvPr id="1373364304" name="Rectangle 1373364304"/>
+                          <wps:cNvPr id="1014385354" name="Rectangle 1014385354"/>
                           <wps:cNvSpPr/>
                           <wps:spPr>
                             <a:xfrm>
@@ -688,7 +688,7 @@
                         </wps:wsp>
                         <pic:pic xmlns:pic="http://schemas.openxmlformats.org/drawingml/2006/picture">
                           <pic:nvPicPr>
-                            <pic:cNvPr id="301580344" name="Image 301580344"/>
+                            <pic:cNvPr id="1679876490" name="Image 1679876490"/>
                             <pic:cNvPicPr>
                               <a:picLocks noChangeAspect="1"/>
                             </pic:cNvPicPr>
@@ -708,7 +708,7 @@
                           </pic:blipFill>
                           <pic:spPr bwMode="auto">
                             <a:xfrm>
-                              <a:off x="169205" y="136790"/>
+                              <a:off x="150155" y="136790"/>
                               <a:ext cx="3645535" cy="1839595"/>
                             </a:xfrm>
                             <a:prstGeom prst="rect">
@@ -727,52 +727,13 @@
                         </pic:pic>
                         <pic:pic xmlns:pic="http://schemas.openxmlformats.org/drawingml/2006/picture">
                           <pic:nvPicPr>
-                            <pic:cNvPr id="1382471682" name="Image 1382471682"/>
-                            <pic:cNvPicPr>
-                              <a:picLocks noChangeAspect="1"/>
-                            </pic:cNvPicPr>
-                          </pic:nvPicPr>
-                          <pic:blipFill rotWithShape="1">
-                            <a:blip r:embed="rId8">
-                              <a:extLst>
-                                <a:ext uri="{28A0092B-C50C-407E-A947-70E740481C1C}">
-                                  <a14:useLocalDpi xmlns:a14="http://schemas.microsoft.com/office/drawing/2010/main" val="0"/>
-                                </a:ext>
-                              </a:extLst>
-                            </a:blip>
-                            <a:srcRect l="35764" r="35779" b="24600"/>
-                            <a:stretch>
-                              <a:fillRect/>
-                            </a:stretch>
-                          </pic:blipFill>
-                          <pic:spPr bwMode="auto">
-                            <a:xfrm>
-                              <a:off x="168923" y="2084344"/>
-                              <a:ext cx="2938145" cy="871855"/>
-                            </a:xfrm>
-                            <a:prstGeom prst="rect">
-                              <a:avLst/>
-                            </a:prstGeom>
-                            <a:noFill/>
-                            <a:ln>
-                              <a:noFill/>
-                            </a:ln>
-                            <a:extLst>
-                              <a:ext uri="{53640926-AAD7-44D8-BBD7-CCE9431645EC}">
-                                <a14:shadowObscured xmlns:a14="http://schemas.microsoft.com/office/drawing/2010/main"/>
-                              </a:ext>
-                            </a:extLst>
-                          </pic:spPr>
-                        </pic:pic>
-                        <pic:pic xmlns:pic="http://schemas.openxmlformats.org/drawingml/2006/picture">
-                          <pic:nvPicPr>
-                            <pic:cNvPr id="497781068" name="Image 497781068"/>
+                            <pic:cNvPr id="1511511444" name="Image 1511511444"/>
                             <pic:cNvPicPr>
                               <a:picLocks noChangeAspect="1"/>
                             </pic:cNvPicPr>
                           </pic:nvPicPr>
                           <pic:blipFill>
-                            <a:blip r:embed="rId9">
+                            <a:blip r:embed="rId8">
                               <a:lum bright="70000" contrast="-70000"/>
                               <a:extLst>
                                 <a:ext uri="{28A0092B-C50C-407E-A947-70E740481C1C}">
@@ -801,13 +762,13 @@
                         </pic:pic>
                         <pic:pic xmlns:pic="http://schemas.openxmlformats.org/drawingml/2006/picture">
                           <pic:nvPicPr>
-                            <pic:cNvPr id="1060428615" name="Image 1060428615"/>
+                            <pic:cNvPr id="1708396343" name="Image 1708396343"/>
                             <pic:cNvPicPr>
                               <a:picLocks noChangeAspect="1"/>
                             </pic:cNvPicPr>
                           </pic:nvPicPr>
                           <pic:blipFill>
-                            <a:blip r:embed="rId9">
+                            <a:blip r:embed="rId8">
                               <a:lum bright="70000" contrast="-70000"/>
                               <a:extLst>
                                 <a:ext uri="{28A0092B-C50C-407E-A947-70E740481C1C}">
@@ -834,6 +795,45 @@
                             </a:ln>
                           </pic:spPr>
                         </pic:pic>
+                        <pic:pic xmlns:pic="http://schemas.openxmlformats.org/drawingml/2006/picture">
+                          <pic:nvPicPr>
+                            <pic:cNvPr id="904778424" name="Image 904778424"/>
+                            <pic:cNvPicPr>
+                              <a:picLocks noChangeAspect="1"/>
+                            </pic:cNvPicPr>
+                          </pic:nvPicPr>
+                          <pic:blipFill rotWithShape="1">
+                            <a:blip r:embed="rId9">
+                              <a:extLst>
+                                <a:ext uri="{28A0092B-C50C-407E-A947-70E740481C1C}">
+                                  <a14:useLocalDpi xmlns:a14="http://schemas.microsoft.com/office/drawing/2010/main" val="0"/>
+                                </a:ext>
+                              </a:extLst>
+                            </a:blip>
+                            <a:srcRect l="35741" r="35742" b="25534"/>
+                            <a:stretch>
+                              <a:fillRect/>
+                            </a:stretch>
+                          </pic:blipFill>
+                          <pic:spPr bwMode="auto">
+                            <a:xfrm>
+                              <a:off x="150313" y="2109601"/>
+                              <a:ext cx="2944495" cy="862965"/>
+                            </a:xfrm>
+                            <a:prstGeom prst="rect">
+                              <a:avLst/>
+                            </a:prstGeom>
+                            <a:noFill/>
+                            <a:ln>
+                              <a:noFill/>
+                            </a:ln>
+                            <a:extLst>
+                              <a:ext uri="{53640926-AAD7-44D8-BBD7-CCE9431645EC}">
+                                <a14:shadowObscured xmlns:a14="http://schemas.microsoft.com/office/drawing/2010/main"/>
+                              </a:ext>
+                            </a:extLst>
+                          </pic:spPr>
+                        </pic:pic>
                       </wpg:wgp>
                     </wpc:wpc>
                   </a:graphicData>
@@ -843,7 +843,7 @@
           </mc:Choice>
           <mc:Fallback>
             <w:pict>
-              <v:group w14:anchorId="549341AB" id="Zone de dessin 1" o:spid="_x0000_s1026" editas="canvas" style="width:809.2pt;height:567pt;mso-position-horizontal-relative:char;mso-position-vertical-relative:line" coordsize="102768,72009" o:gfxdata="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">
+              <v:group w14:anchorId="42D7F5FE" id="Zone de dessin 1" o:spid="_x0000_s1026" editas="canvas" style="width:809.2pt;height:567pt;mso-position-horizontal-relative:char;mso-position-vertical-relative:line" coordsize="102768,72009" o:gfxdata="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">
                 <v:shapetype id="_x0000_t75" coordsize="21600,21600" o:spt="75" o:preferrelative="t" path="m@4@5l@4@11@9@11@9@5xe" filled="f" stroked="f">
                   <v:stroke joinstyle="miter"/>
                   <v:formulas>
@@ -867,64 +867,64 @@
                   <v:fill r:id="rId10" o:title="" recolor="t" rotate="t" o:detectmouseclick="t" type="tile"/>
                   <v:path o:connecttype="none"/>
                 </v:shape>
-                <v:group id="Groupe 148342048" o:spid="_x0000_s1028" style="position:absolute;left:4896;top:3143;width:39604;height:31215" coordorigin="6828,4647" coordsize="39603,31215" o:gfxdata="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">
-                  <v:rect id="Rectangle 1903031763" o:spid="_x0000_s1029" style="position:absolute;left:6828;top:4647;width:39604;height:31216;visibility:visible;mso-wrap-style:square;v-text-anchor:middle" o:gfxdata="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" filled="f" strokecolor="white [3212]" strokeweight="1pt"/>
-                  <v:shape id="Image 1863099039" o:spid="_x0000_s1030" type="#_x0000_t75" style="position:absolute;left:8520;top:6015;width:36455;height:18396;visibility:visible;mso-wrap-style:square" o:gfxdata="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">
+                <v:group id="Groupe 1841248240" o:spid="_x0000_s1028" style="position:absolute;left:4896;top:3143;width:39604;height:31215" coordorigin="4896,3143" coordsize="39603,31215" o:gfxdata="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">
+                  <v:rect id="Rectangle 1903031763" o:spid="_x0000_s1029" style="position:absolute;left:4896;top:3143;width:39604;height:31215;visibility:visible;mso-wrap-style:square;v-text-anchor:middle" o:gfxdata="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" filled="f" strokecolor="white [3212]" strokeweight="1pt"/>
+                  <v:shape id="Image 1863099039" o:spid="_x0000_s1030" type="#_x0000_t75" style="position:absolute;left:6398;top:4511;width:36455;height:18396;visibility:visible;mso-wrap-style:square" o:gfxdata="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">
                     <v:imagedata r:id="rId11" o:title="" cropbottom="8947f" cropleft="21173f" cropright="21229f"/>
                   </v:shape>
-                  <v:shape id="Image 1077118535" o:spid="_x0000_s1031" type="#_x0000_t75" style="position:absolute;left:8517;top:25491;width:29381;height:8718;visibility:visible;mso-wrap-style:square" o:gfxdata="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">
-                    <v:imagedata r:id="rId12" o:title="" cropbottom="16122f" cropleft="23438f" cropright="23448f"/>
+                  <v:shape id="Image 1455474112" o:spid="_x0000_s1031" type="#_x0000_t75" style="position:absolute;left:36147;top:24936;width:7200;height:7200;visibility:visible;mso-wrap-style:square" o:gfxdata="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">
+                    <v:imagedata r:id="rId12" o:title="" gain="19661f" blacklevel="22938f"/>
                   </v:shape>
-                  <v:shape id="Image 1455474112" o:spid="_x0000_s1032" type="#_x0000_t75" style="position:absolute;left:38078;top:26441;width:7200;height:7200;visibility:visible;mso-wrap-style:square" o:gfxdata="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">
-                    <v:imagedata r:id="rId13" o:title="" gain="19661f" blacklevel="22938f"/>
+                  <v:shape id="Image 976715722" o:spid="_x0000_s1032" type="#_x0000_t75" style="position:absolute;left:6815;top:4017;width:7200;height:7200;flip:x;visibility:visible;mso-wrap-style:square" o:gfxdata="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">
+                    <v:imagedata r:id="rId12" o:title="" gain="19661f" blacklevel="22938f"/>
                   </v:shape>
-                  <v:shape id="Image 976715722" o:spid="_x0000_s1033" type="#_x0000_t75" style="position:absolute;left:8746;top:5522;width:7200;height:7200;flip:x;visibility:visible;mso-wrap-style:square" o:gfxdata="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">
-                    <v:imagedata r:id="rId13" o:title="" gain="19661f" blacklevel="22938f"/>
+                  <v:shape id="Image 72853127" o:spid="_x0000_s1033" type="#_x0000_t75" style="position:absolute;left:6400;top:24239;width:29445;height:8629;visibility:visible;mso-wrap-style:square" o:gfxdata="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">
+                    <v:imagedata r:id="rId13" o:title="" cropbottom="16734f" cropleft="23423f" cropright="23424f"/>
                   </v:shape>
                 </v:group>
-                <v:group id="Groupe 898762782" o:spid="_x0000_s1034" style="position:absolute;left:50160;top:3148;width:39599;height:31210" coordsize="39603,31215" o:gfxdata="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">
-                  <v:rect id="Rectangle 1954096823" o:spid="_x0000_s1035" style="position:absolute;width:39603;height:31215;visibility:visible;mso-wrap-style:square;v-text-anchor:middle" o:gfxdata="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" filled="f" strokecolor="white [3212]" strokeweight="1pt"/>
-                  <v:shape id="Image 1669418917" o:spid="_x0000_s1036" type="#_x0000_t75" style="position:absolute;left:1692;top:1367;width:36455;height:18396;visibility:visible;mso-wrap-style:square" o:gfxdata="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">
+                <v:group id="Groupe 2130575211" o:spid="_x0000_s1034" style="position:absolute;left:47456;top:3143;width:39599;height:31210" coordsize="39603,31215" o:gfxdata="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">
+                  <v:rect id="Rectangle 650922340" o:spid="_x0000_s1035" style="position:absolute;width:39603;height:31215;visibility:visible;mso-wrap-style:square;v-text-anchor:middle" o:gfxdata="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" filled="f" strokecolor="white [3212]" strokeweight="1pt"/>
+                  <v:shape id="Image 1497182814" o:spid="_x0000_s1036" type="#_x0000_t75" style="position:absolute;left:1501;top:1367;width:36455;height:18396;visibility:visible;mso-wrap-style:square" o:gfxdata="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">
                     <v:imagedata r:id="rId11" o:title="" cropbottom="8947f" cropleft="21173f" cropright="21229f"/>
                   </v:shape>
-                  <v:shape id="Image 2081468940" o:spid="_x0000_s1037" type="#_x0000_t75" style="position:absolute;left:1689;top:20843;width:29381;height:8718;visibility:visible;mso-wrap-style:square" o:gfxdata="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">
-                    <v:imagedata r:id="rId12" o:title="" cropbottom="16122f" cropleft="23438f" cropright="23448f"/>
+                  <v:shape id="Image 1796803993" o:spid="_x0000_s1037" type="#_x0000_t75" style="position:absolute;left:31250;top:21793;width:7200;height:7200;visibility:visible;mso-wrap-style:square" o:gfxdata="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">
+                    <v:imagedata r:id="rId12" o:title="" gain="19661f" blacklevel="22938f"/>
                   </v:shape>
-                  <v:shape id="Image 1860022118" o:spid="_x0000_s1038" type="#_x0000_t75" style="position:absolute;left:31250;top:21793;width:7200;height:7200;visibility:visible;mso-wrap-style:square" o:gfxdata="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">
-                    <v:imagedata r:id="rId13" o:title="" gain="19661f" blacklevel="22938f"/>
+                  <v:shape id="Image 1115001763" o:spid="_x0000_s1038" type="#_x0000_t75" style="position:absolute;left:1918;top:874;width:7200;height:7200;flip:x;visibility:visible;mso-wrap-style:square" o:gfxdata="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">
+                    <v:imagedata r:id="rId12" o:title="" gain="19661f" blacklevel="22938f"/>
                   </v:shape>
-                  <v:shape id="Image 1810537660" o:spid="_x0000_s1039" type="#_x0000_t75" style="position:absolute;left:1918;top:874;width:7200;height:7200;flip:x;visibility:visible;mso-wrap-style:square" o:gfxdata="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">
-                    <v:imagedata r:id="rId13" o:title="" gain="19661f" blacklevel="22938f"/>
+                  <v:shape id="Image 1222394338" o:spid="_x0000_s1039" type="#_x0000_t75" style="position:absolute;left:1503;top:21096;width:29445;height:8629;visibility:visible;mso-wrap-style:square" o:gfxdata="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">
+                    <v:imagedata r:id="rId13" o:title="" cropbottom="16734f" cropleft="23423f" cropright="23424f"/>
                   </v:shape>
                 </v:group>
-                <v:group id="Groupe 1693235423" o:spid="_x0000_s1040" style="position:absolute;left:4982;top:36756;width:39599;height:31211" coordsize="39603,31215" o:gfxdata="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">
-                  <v:rect id="Rectangle 16958749" o:spid="_x0000_s1041" style="position:absolute;width:39603;height:31215;visibility:visible;mso-wrap-style:square;v-text-anchor:middle" o:gfxdata="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" filled="f" strokecolor="white [3212]" strokeweight="1pt"/>
-                  <v:shape id="Image 6051829" o:spid="_x0000_s1042" type="#_x0000_t75" style="position:absolute;left:1692;top:1367;width:36455;height:18396;visibility:visible;mso-wrap-style:square" o:gfxdata="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">
+                <v:group id="Groupe 1557453790" o:spid="_x0000_s1040" style="position:absolute;left:4902;top:36344;width:39598;height:31210" coordsize="39603,31215" o:gfxdata="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">
+                  <v:rect id="Rectangle 278827721" o:spid="_x0000_s1041" style="position:absolute;width:39603;height:31215;visibility:visible;mso-wrap-style:square;v-text-anchor:middle" o:gfxdata="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" filled="f" strokecolor="white [3212]" strokeweight="1pt"/>
+                  <v:shape id="Image 2132486792" o:spid="_x0000_s1042" type="#_x0000_t75" style="position:absolute;left:1501;top:1367;width:36455;height:18396;visibility:visible;mso-wrap-style:square" o:gfxdata="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">
                     <v:imagedata r:id="rId11" o:title="" cropbottom="8947f" cropleft="21173f" cropright="21229f"/>
                   </v:shape>
-                  <v:shape id="Image 1564200997" o:spid="_x0000_s1043" type="#_x0000_t75" style="position:absolute;left:1689;top:20843;width:29381;height:8718;visibility:visible;mso-wrap-style:square" o:gfxdata="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">
-                    <v:imagedata r:id="rId12" o:title="" cropbottom="16122f" cropleft="23438f" cropright="23448f"/>
+                  <v:shape id="Image 325094628" o:spid="_x0000_s1043" type="#_x0000_t75" style="position:absolute;left:31250;top:21793;width:7200;height:7200;visibility:visible;mso-wrap-style:square" o:gfxdata="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">
+                    <v:imagedata r:id="rId12" o:title="" gain="19661f" blacklevel="22938f"/>
                   </v:shape>
-                  <v:shape id="Image 1296699028" o:spid="_x0000_s1044" type="#_x0000_t75" style="position:absolute;left:31250;top:21793;width:7200;height:7200;visibility:visible;mso-wrap-style:square" o:gfxdata="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">
-                    <v:imagedata r:id="rId13" o:title="" gain="19661f" blacklevel="22938f"/>
+                  <v:shape id="Image 1348610929" o:spid="_x0000_s1044" type="#_x0000_t75" style="position:absolute;left:1918;top:874;width:7200;height:7200;flip:x;visibility:visible;mso-wrap-style:square" o:gfxdata="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">
+                    <v:imagedata r:id="rId12" o:title="" gain="19661f" blacklevel="22938f"/>
                   </v:shape>
-                  <v:shape id="Image 1777609956" o:spid="_x0000_s1045" type="#_x0000_t75" style="position:absolute;left:1918;top:874;width:7200;height:7200;flip:x;visibility:visible;mso-wrap-style:square" o:gfxdata="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">
-                    <v:imagedata r:id="rId13" o:title="" gain="19661f" blacklevel="22938f"/>
+                  <v:shape id="Image 995971405" o:spid="_x0000_s1045" type="#_x0000_t75" style="position:absolute;left:1503;top:21096;width:29445;height:8629;visibility:visible;mso-wrap-style:square" o:gfxdata="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">
+                    <v:imagedata r:id="rId13" o:title="" cropbottom="16734f" cropleft="23423f" cropright="23424f"/>
                   </v:shape>
                 </v:group>
-                <v:group id="Groupe 1993026051" o:spid="_x0000_s1046" style="position:absolute;left:50160;top:36852;width:39599;height:31210" coordsize="39603,31215" o:gfxdata="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">
-                  <v:rect id="Rectangle 1373364304" o:spid="_x0000_s1047" style="position:absolute;width:39603;height:31215;visibility:visible;mso-wrap-style:square;v-text-anchor:middle" o:gfxdata="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" filled="f" strokecolor="white [3212]" strokeweight="1pt"/>
-                  <v:shape id="Image 301580344" o:spid="_x0000_s1048" type="#_x0000_t75" style="position:absolute;left:1692;top:1367;width:36455;height:18396;visibility:visible;mso-wrap-style:square" o:gfxdata="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">
+                <v:group id="Groupe 2146968744" o:spid="_x0000_s1046" style="position:absolute;left:47393;top:36344;width:39598;height:31210" coordsize="39603,31215" o:gfxdata="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">
+                  <v:rect id="Rectangle 1014385354" o:spid="_x0000_s1047" style="position:absolute;width:39603;height:31215;visibility:visible;mso-wrap-style:square;v-text-anchor:middle" o:gfxdata="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" filled="f" strokecolor="white [3212]" strokeweight="1pt"/>
+                  <v:shape id="Image 1679876490" o:spid="_x0000_s1048" type="#_x0000_t75" style="position:absolute;left:1501;top:1367;width:36455;height:18396;visibility:visible;mso-wrap-style:square" o:gfxdata="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">
                     <v:imagedata r:id="rId11" o:title="" cropbottom="8947f" cropleft="21173f" cropright="21229f"/>
                   </v:shape>
-                  <v:shape id="Image 1382471682" o:spid="_x0000_s1049" type="#_x0000_t75" style="position:absolute;left:1689;top:20843;width:29381;height:8718;visibility:visible;mso-wrap-style:square" o:gfxdata="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">
-                    <v:imagedata r:id="rId12" o:title="" cropbottom="16122f" cropleft="23438f" cropright="23448f"/>
+                  <v:shape id="Image 1511511444" o:spid="_x0000_s1049" type="#_x0000_t75" style="position:absolute;left:31250;top:21793;width:7200;height:7200;visibility:visible;mso-wrap-style:square" o:gfxdata="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">
+                    <v:imagedata r:id="rId12" o:title="" gain="19661f" blacklevel="22938f"/>
                   </v:shape>
-                  <v:shape id="Image 497781068" o:spid="_x0000_s1050" type="#_x0000_t75" style="position:absolute;left:31250;top:21793;width:7200;height:7200;visibility:visible;mso-wrap-style:square" o:gfxdata="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">
-                    <v:imagedata r:id="rId13" o:title="" gain="19661f" blacklevel="22938f"/>
+                  <v:shape id="Image 1708396343" o:spid="_x0000_s1050" type="#_x0000_t75" style="position:absolute;left:1918;top:874;width:7200;height:7200;flip:x;visibility:visible;mso-wrap-style:square" o:gfxdata="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">
+                    <v:imagedata r:id="rId12" o:title="" gain="19661f" blacklevel="22938f"/>
                   </v:shape>
-                  <v:shape id="Image 1060428615" o:spid="_x0000_s1051" type="#_x0000_t75" style="position:absolute;left:1918;top:874;width:7200;height:7200;flip:x;visibility:visible;mso-wrap-style:square" o:gfxdata="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">
-                    <v:imagedata r:id="rId13" o:title="" gain="19661f" blacklevel="22938f"/>
+                  <v:shape id="Image 904778424" o:spid="_x0000_s1051" type="#_x0000_t75" style="position:absolute;left:1503;top:21096;width:29445;height:8629;visibility:visible;mso-wrap-style:square" o:gfxdata="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">
+                    <v:imagedata r:id="rId13" o:title="" cropbottom="16734f" cropleft="23423f" cropright="23424f"/>
                   </v:shape>
                 </v:group>
                 <w10:anchorlock/>
@@ -3343,7 +3343,7 @@
                 <w:sz w:val="16"/>
                 <w:szCs w:val="16"/>
               </w:rPr>
-              <w:t>Défausse</w:t>
+              <w:t>Cimetière</w:t>
             </w:r>
           </w:p>
         </w:tc>

</xml_diff>